<commit_message>
Update thesis proposal v10: remove Brussels/FOI from thesis structure
Brussels visiting work moved to brief contextual mention.
No longer a chapter or cronoprogramma item.

Co-Authored-By: Claude Opus 4.6 (1M context) <noreply@anthropic.com>
</commit_message>
<xml_diff>
--- a/context/Proposta_Tesi_PhD_Quaglia_FULL_v10.docx
+++ b/context/Proposta_Tesi_PhD_Quaglia_FULL_v10.docx
@@ -650,7 +650,7 @@
         <w:rPr>
           <w:sz w:val="22"/>
         </w:rPr>
-        <w:t xml:space="preserve">La ricerca sostiene che la funzione direzionale di un sistema informativo manageriale nella PA locale dipende da un insieme di condizioni progettuali e istituzionali — fra cui l'integrazione nel ciclo di programmazione e controllo, l'autorevolezza delle fonti, la profondità temporale e il benchmarking — nessuna delle quali è da sola sufficiente. Le due famiglie studiate illuminano queste condizioni da prospettive complementari: le urban dashboard (Capp. 2–3) dichiarano funzione direzionale e garantiscono accessibilità pubblica e copertura multi-dominio, ma difettano delle condizioni istituzionali che renderebbero la funzione direzionale esercitabile; il sistema di controllo progettato nel Cap. 4 incorpora le condizioni istituzionali per design ma opera come strumento interno, non accessibile alla cittadinanza. La partecipazione dei cittadini risulta sotto-implementata da entrambe le famiglie. La lettura congiunta proposta dalla presente ricerca — che la letteratura non ha finora tentato (§2.1) — consente di identificare le condizioni la cui combinazione discrimina la funzione direzionale effettiva, con il contributo originale del modello a due livelli Comune-azienda / Comune-governo-del-territorio rilevante per lo studio dell'azienda pubblica locale.</w:t>
+        <w:t xml:space="preserve">La ricerca sostiene che la funzione direzionale di un sistema informativo manageriale nella PA locale dipende da un insieme di condizioni progettuali e istituzionali — fra cui l'integrazione nel ciclo di programmazione e controllo, l'autorevolezza delle fonti, la profondità temporale e il benchmarking — nessuna delle quali è da sola sufficiente. Le due famiglie studiate illuminano queste condizioni da prospettive complementari: le urban dashboard (Capp. 2–3) dichiarano funzione direzionale e garantiscono accessibilità pubblica e copertura multi-dominio, ma difettano delle condizioni istituzionali che renderebbero la funzione direzionale esercitabile; il sistema di controllo progettato nel Cap. 4 incorpora le condizioni istituzionali per design ma opera come strumento interno, non accessibile alla cittadinanza. La partecipazione dei cittadini risulta sotto-implementata nelle UD studiate (3/21, Cap. 3) e assente nel sistema progettato nel Cap. 4, che opera come strumento interno per design. La lettura congiunta proposta dalla presente ricerca — che la letteratura non ha finora tentato (§2.1) — consente di identificare le condizioni la cui combinazione discrimina la funzione direzionale effettiva, con il contributo originale del modello a due livelli Comune-azienda / Comune-governo-del-territorio rilevante per lo studio dell'azienda pubblica locale.</w:t>
       </w:r>
     </w:p>
     <w:p>
@@ -861,7 +861,7 @@
         <w:rPr>
           <w:sz w:val="22"/>
         </w:rPr>
-        <w:t xml:space="preserve">La diagnosi delle urban dashboard (Capp. 2–3) rivela condizioni progettuali la cui assenza compromette la funzione direzionale: dati poco autorevoli, assenza di profondità temporale, benchmarking scarso, partecipazione dichiarata ma non realizzata. Il Cap. 4, progettando un sistema di controllo per l'economia circolare urbana, illustra come queste condizioni possano essere incorporate nel design: il sistema è ancorato al DUP, costruito su dati istituzionali, dotato di benchmarking fra 11 città.</w:t>
+        <w:t xml:space="preserve">La diagnosi delle urban dashboard (Capp. 2–3) rivela condizioni progettuali la cui assenza compromette la funzione direzionale: dati poco autorevoli (10/21), assenza di profondità temporale (6/21), benchmarking scarso (10/21), partecipazione dichiarata ma non realizzata (3/21). Queste condizioni sono identificate dal Cap. 3 attraverso la letteratura UD, non importate dalla tradizione PM. Il Cap. 4, progettando un sistema di controllo per l'economia circolare urbana nell'ambito di un progetto indipendente (C-City Genova), incorpora per design tre di queste quattro condizioni: il sistema è costruito su dati istituzionali (ISTAT, ARPAL — autorevolezza), dotato di serie storiche DUP (profondità temporale) e di benchmarking fra 11 città. La corrispondenza non è pianificata: i tre lavori sono stati condotti indipendentemente (§3, Nota). L'accostamento ha senso perché entrambe le famiglie, pur avendo natura disciplinare distinta (§4.1), dichiarano di produrre rappresentazione strutturata della PA locale attraverso indicatori (§1.2) — e le condizioni che il Cap. 3 identifica come critiche per questa funzione nelle UD risultano incorporate nel design del sistema PM del Cap. 4. La quarta condizione — la partecipazione dei cittadini — non è affrontata dal Cap. 4, che opera come strumento interno, e risulta sotto-implementata nelle UD studiate (3/21, Cap. 3) e assente nel sistema progettato nel Cap. 4, che opera come strumento interno per design.</w:t>
       </w:r>
     </w:p>
     <w:p>
@@ -872,7 +872,7 @@
         <w:rPr>
           <w:sz w:val="22"/>
         </w:rPr>
-        <w:t xml:space="preserve">L'integrazione nel ciclo programmatorio è tuttavia condizione necessaria ma non sufficiente: anche sistemi formalmente integrati possono produrre compliance rituale e gaming (Arnaboldi, Lapsley &amp; Steccolini 2015), e l'uso dell'informazione resta prevalentemente passivo al livello operativo anche in enti locali con sistemi consolidati (Micheli &amp; Pavlov 2020, pp. 80–81).</w:t>
+        <w:t xml:space="preserve">L'integrazione nel ciclo programmatorio — condizione costitutiva dei sistemi PM ma non misurata fra i 19 CSF del Cap. 3 — rappresenta un'ulteriore dimensione che distingue strutturalmente le due famiglie. L'integrazione è tuttavia condizione necessaria ma non sufficiente: anche sistemi formalmente integrati possono produrre adempimento formale senza uso decisionale effettivo e manipolazione degli indicatori (Arnaboldi, Lapsley &amp; Steccolini 2015), e l'uso dell'informazione resta prevalentemente passivo al livello operativo anche in enti locali con sistemi consolidati (Micheli &amp; Pavlov 2020, pp. 80–81).</w:t>
       </w:r>
     </w:p>
     <w:p>
@@ -970,7 +970,7 @@
         <w:rPr>
           <w:sz w:val="22"/>
         </w:rPr>
-        <w:t xml:space="preserve">I tre studi hanno esaminato le due famiglie di strumenti che compongono la categoria dei sistemi informativi manageriali basati su indicatori strutturati per la PA locale. Ciascuna famiglia contribuisce alla comprensione della categoria nel suo insieme: l'analisi delle urban dashboard (Capp. 2–3) rivela le condizioni la cui assenza compromette la funzione direzionale; la progettazione del sistema di controllo (Cap. 4) illustra le condizioni la cui presenza la rende esercitabile. Le condizioni di efficacia che emergono non sono proprietà di una sola famiglia ma della categoria: definiscono cosa serve perché un sistema informativo di questo tipo — qualunque sia la sua origine disciplinare — passi dalla funzione direzionale dichiarata alla funzione direzionale esercitata. Il capitolo presenta la sintesi trasversale dei tre capitoli di ricerca, le implicazioni per il disegno dei sistemi informativi manageriali nell'azienda pubblica locale e i limiti dello studio. Fra questi, il sistema progettato nel Cap. 4 non è stato testato in fase di implementazione: la letteratura mostra che le condizioni d'uso effettivo dell'informazione di performance dipendono dall'interpretazione che gli utenti danno al ruolo della misurazione, e che tale interpretazione può divergere significativamente fra livelli gerarchici dell'organizzazione (Micheli &amp; Pavlov 2020); la verifica di queste dinamiche costituisce una prospettiva di ricerca futura.</w:t>
+        <w:t xml:space="preserve">I tre studi hanno esaminato le due famiglie di strumenti che compongono la categoria dei sistemi informativi manageriali basati su indicatori strutturati per la PA locale. Ciascuna famiglia contribuisce alla comprensione della categoria nel suo insieme: l'analisi delle urban dashboard (Capp. 2–3) rivela le condizioni la cui assenza compromette la funzione direzionale; la progettazione del sistema di controllo (Cap. 4) illustra come queste condizioni possano essere incorporate nel design. Le condizioni di efficacia che emergono non sono proprietà di una sola delle due famiglie studiate ma emergono indipendentemente da entrambe, suggerendo che possano essere trasversali alla categoria dei sistemi informativi a indicatori strutturati — ipotesi che ricerche future potranno verificare su altre tipologie di strumenti (indicatori BES, sistemi SDG, bilanci sociali). Il capitolo presenta la sintesi trasversale dei tre capitoli di ricerca, le implicazioni per il disegno dei sistemi informativi manageriali nell'azienda pubblica locale e i limiti dello studio. Fra questi, il sistema progettato nel Cap. 4 non è stato testato in fase di implementazione: la letteratura mostra che le condizioni d'uso effettivo dell'informazione di performance dipendono dall'interpretazione che gli utenti danno al ruolo della misurazione, e che tale interpretazione può divergere significativamente fra livelli gerarchici dell'organizzazione (Micheli &amp; Pavlov 2020); la verifica di queste dinamiche costituisce una ulteriore prospettiva di ricerca futura.</w:t>
       </w:r>
     </w:p>
     <w:p>
@@ -1033,34 +1033,9 @@
       </w:pPr>
       <w:r>
         <w:rPr>
-          <w:b/>
-          <w:sz w:val="28"/>
+          <w:sz w:val="22"/>
         </w:rPr>
-        <w:t>5. Linea parallela di ricerca: transparency passiva e accountability</w:t>
-      </w:r>
-    </w:p>
-    <w:p>
-      <w:pPr>
-        <w:jc w:val="both"/>
-      </w:pPr>
-      <w:r>
-        <w:t>Il periodo di ricerca presso l'Université Libre de Bruxelles (ULB-CEPAP) ha prodotto una linea di ricerca complementare sulla responsiveness delle pubbliche amministrazioni belghe alle richieste di Freedom of Information (FOI). Il lavoro è stato sviluppato in autonomia e destinato a pubblicazione separata (Azienda Pubblica; conferenza ENPA).</w:t>
-      </w:r>
-    </w:p>
-    <w:p>
-      <w:pPr>
-        <w:jc w:val="both"/>
-      </w:pPr>
-      <w:r>
-        <w:t>La collocazione di questa linea nella cornice della tesi non è quella di un lavoro fuori perimetro, bensì di uno studio speculare: essa studia il comportamento organizzativo delle PA sul versante della transparency passiva — ossia la risposta dell'ente a richieste esterne di accesso all'informazione — che costituisce la controparte della transparency attiva — ossia la pubblicazione proattiva di informazione strutturata via dashboard e sistemi di performance — oggetto dei Capp. 2–4. Entrambi i versanti sono comportamenti organizzativi di accountability delle pubbliche amministrazioni misurabili con strumenti aziendalistici: il primo attraverso indicatori di tempestività e completezza della risposta, il secondo attraverso indicatori di efficacia del sistema informativo rispetto al ciclo direzionale.</w:t>
-      </w:r>
-    </w:p>
-    <w:p>
-      <w:pPr>
-        <w:jc w:val="both"/>
-      </w:pPr>
-      <w:r>
-        <w:t>La tensione concettuale fra le due dimensioni — pubblicazione proattiva vs. risposta a richiesta — e la loro comune problematicità è ben documentata nella letteratura italiana SECS-P/07 sul contesto municipale: la pubblicazione dell'informazione, senza dettaglio e contenuto utile, non automaticamente genera accountability (Riso, Tallaki &amp; Bracci 2022, p. 356); e l'accesso all'informazione via istituti come il Freedom of Information Act italiano (D.lgs. 97/2016) richiede ingaggio organizzativo attivo dell'ente per passare "from just a manifesto commitment to a concrete reality in the citizens-public administration relationship" (Castellini &amp; Riso 2023, p. 150).</w:t>
+        <w:t xml:space="preserve">5. Attività di ricerca complementare</w:t>
       </w:r>
     </w:p>
     <w:p>
@@ -1071,7 +1046,40 @@
         <w:rPr>
           <w:sz w:val="22"/>
         </w:rPr>
-        <w:t xml:space="preserve">Il posizionamento editoriale della linea nella tesi è previsto come sezione dedicata all'interno del Cap. 5 (conclusioni), dove la transparency passiva è discussa come controparte empirica della transparency attiva oggetto dei Capp. 2–4.</w:t>
+        <w:t xml:space="preserve">Il percorso dottorale ha incluso un periodo di visiting presso l'Université Libre de Bruxelles (ULB-CEPAP), durante il quale il candidato ha contribuito a una ricerca sulla transparency passiva nelle pubbliche amministrazioni, oggetto di pubblicazioni in collaborazione con i ricercatori del centro ospitante. Questa linea di ricerca, pur collegata al tema dell'accountability che attraversa la tesi, è sviluppata come produzione scientifica autonoma rispetto alla dissertazione.</w:t>
+      </w:r>
+    </w:p>
+    <w:p>
+      <w:pPr>
+        <w:jc w:val="both"/>
+      </w:pPr>
+      <w:r>
+        <w:rPr>
+          <w:sz w:val="22"/>
+        </w:rPr>
+        <w:t xml:space="preserve"/>
+      </w:r>
+    </w:p>
+    <w:p>
+      <w:pPr>
+        <w:jc w:val="both"/>
+      </w:pPr>
+      <w:r>
+        <w:rPr>
+          <w:sz w:val="22"/>
+        </w:rPr>
+        <w:t xml:space="preserve"/>
+      </w:r>
+    </w:p>
+    <w:p>
+      <w:pPr>
+        <w:jc w:val="both"/>
+      </w:pPr>
+      <w:r>
+        <w:rPr>
+          <w:sz w:val="22"/>
+        </w:rPr>
+        <w:t xml:space="preserve"/>
       </w:r>
     </w:p>
     <w:p>
@@ -1173,7 +1181,7 @@
         <w:rPr>
           <w:sz w:val="22"/>
         </w:rPr>
-        <w:t xml:space="preserve">Luglio – Agosto 2026. Finalizzazione del Cap. 4 e sottomissione del paper relativo a Management Control. Stesura del Cap. 5 (conclusioni trasversali), inclusa la sezione sulla transparency passiva (§5).</w:t>
+        <w:t xml:space="preserve">Luglio – Agosto 2026. Finalizzazione del Cap. 4 e sottomissione del paper relativo a Management Control. Stesura del Cap. 5 (conclusioni trasversali).</w:t>
       </w:r>
     </w:p>
     <w:p>

</xml_diff>